<commit_message>
Update Scenario A target to 3,000 MW; revise Scenario B for combined investment
Scenario A: 526 MW baseline → 3,000 MW target (+2,474 MW, not +2,274)
  - Investment: +IDR 274.6T (at IDR 111B/MW)
  - CIT increment: +51.243T; SD increment: +7.813T; Total: +59.056T (+0.267% GDP)
  - Scenario A total: 3,000 MW, 660.4T, 189.715T total (0.857% GDP)

Scenario B (combined A+B): universal VAT on full 660.4T investment
  - VAT+Duty: 31.204T (660.4 × 35% × 13.5%)
  - Total: 219.942T (0.993% GDP)

B standalone (baseline only): unchanged at 147.912T (0.668% GDP)
Appendix B: added combined A+B VAT base (IDR 231.1T)

Files: fiscal_cost_report.tex (updated), .pdf (recompiled, 0 errors), .docx (updated)

https://claude.ai/code/session_018m2ceypEakZpmjRE2PTWZv
</commit_message>
<xml_diff>
--- a/reports/fiscal_cost_report.docx
+++ b/reports/fiscal_cost_report.docx
@@ -1521,7 +1521,7 @@
         <w:rPr>
           <w:sz w:val="20"/>
         </w:rPr>
-        <w:t>Scenario A: expansion to 2,800 MW operational by 2030, adding 1888 MW beyond the current 912 MW at IDR 111B/MW (blended benchmark), requiring IDR 209.5T of additional investment. GMT/non-GMT split mirrors current database (43%/57%); 10-year holiday for new entrants. Scenario B: VAT and import duty exemptions extended to all operators, applying 35% equipment share to total investment.</w:t>
+        <w:t>Scenario A: expansion to 3,000 MW operational by 2030, adding 2,474 MW beyond the current 526 MW at IDR 111B/MW (blended benchmark), requiring IDR 274.6T of additional investment. GMT/non-GMT split mirrors current database (43%/57%); 10-year holiday for new entrants. Scenario B: VAT and import duty exemptions extended to all operators, applying 35% equipment share to combined Scenario A investment (IDR 660.4T).</w:t>
       </w:r>
     </w:p>
     <w:tbl>
@@ -1731,7 +1731,7 @@
                 <w:b/>
                 <w:sz w:val="17"/>
               </w:rPr>
-              <w:t>3475</w:t>
+              <w:t>3089</w:t>
             </w:r>
           </w:p>
         </w:tc>
@@ -1858,7 +1858,7 @@
               <w:rPr>
                 <w:sz w:val="17"/>
               </w:rPr>
-              <w:t>A: +1,888 MW by 2030</w:t>
+              <w:t>A: +2,474 MW by 2030</w:t>
             </w:r>
           </w:p>
         </w:tc>
@@ -1875,7 +1875,7 @@
               <w:rPr>
                 <w:sz w:val="17"/>
               </w:rPr>
-              <w:t>+1888</w:t>
+              <w:t>+2474</w:t>
             </w:r>
           </w:p>
         </w:tc>
@@ -1892,7 +1892,7 @@
               <w:rPr>
                 <w:sz w:val="17"/>
               </w:rPr>
-              <w:t>+209.5</w:t>
+              <w:t>+274.6</w:t>
             </w:r>
           </w:p>
         </w:tc>
@@ -1909,7 +1909,7 @@
               <w:rPr>
                 <w:sz w:val="17"/>
               </w:rPr>
-              <w:t>+42.001</w:t>
+              <w:t>+51.243</w:t>
             </w:r>
           </w:p>
         </w:tc>
@@ -1926,7 +1926,7 @@
               <w:rPr>
                 <w:sz w:val="17"/>
               </w:rPr>
-              <w:t>+5.964</w:t>
+              <w:t>+7.813</w:t>
             </w:r>
           </w:p>
         </w:tc>
@@ -1960,7 +1960,7 @@
               <w:rPr>
                 <w:sz w:val="17"/>
               </w:rPr>
-              <w:t>+47.965</w:t>
+              <w:t>+59.056</w:t>
             </w:r>
           </w:p>
         </w:tc>
@@ -1977,7 +1977,7 @@
               <w:rPr>
                 <w:sz w:val="17"/>
               </w:rPr>
-              <w:t>+0.217%</w:t>
+              <w:t>+0.267%</w:t>
             </w:r>
           </w:p>
         </w:tc>
@@ -1997,7 +1997,7 @@
                 <w:b/>
                 <w:sz w:val="17"/>
               </w:rPr>
-              <w:t xml:space="preserve">  Scenario A total</w:t>
+              <w:t>Scenario A total</w:t>
             </w:r>
           </w:p>
         </w:tc>
@@ -2015,7 +2015,7 @@
                 <w:b/>
                 <w:sz w:val="17"/>
               </w:rPr>
-              <w:t>5363</w:t>
+              <w:t>3000</w:t>
             </w:r>
           </w:p>
         </w:tc>
@@ -2033,7 +2033,7 @@
                 <w:b/>
                 <w:sz w:val="17"/>
               </w:rPr>
-              <w:t>595.4</w:t>
+              <w:t>660.4</w:t>
             </w:r>
           </w:p>
         </w:tc>
@@ -2051,7 +2051,7 @@
                 <w:b/>
                 <w:sz w:val="17"/>
               </w:rPr>
-              <w:t>160.706</w:t>
+              <w:t>169.948</w:t>
             </w:r>
           </w:p>
         </w:tc>
@@ -2069,7 +2069,7 @@
                 <w:b/>
                 <w:sz w:val="17"/>
               </w:rPr>
-              <w:t>16.941</w:t>
+              <w:t>18.790</w:t>
             </w:r>
           </w:p>
         </w:tc>
@@ -2105,7 +2105,7 @@
                 <w:b/>
                 <w:sz w:val="17"/>
               </w:rPr>
-              <w:t>178.624</w:t>
+              <w:t>189.715</w:t>
             </w:r>
           </w:p>
         </w:tc>
@@ -2123,7 +2123,7 @@
                 <w:b/>
                 <w:sz w:val="17"/>
               </w:rPr>
-              <w:t>0.807%</w:t>
+              <w:t>0.857%</w:t>
             </w:r>
           </w:p>
         </w:tc>
@@ -2159,7 +2159,7 @@
               <w:rPr>
                 <w:sz w:val="17"/>
               </w:rPr>
-              <w:t>3475</w:t>
+              <w:t>3089</w:t>
             </w:r>
           </w:p>
         </w:tc>
@@ -2299,7 +2299,7 @@
                 <w:b/>
                 <w:sz w:val="17"/>
               </w:rPr>
-              <w:t>5363</w:t>
+              <w:t>3000</w:t>
             </w:r>
           </w:p>
         </w:tc>
@@ -2317,7 +2317,7 @@
                 <w:b/>
                 <w:sz w:val="17"/>
               </w:rPr>
-              <w:t>595.4</w:t>
+              <w:t>660.4</w:t>
             </w:r>
           </w:p>
         </w:tc>
@@ -2335,7 +2335,7 @@
                 <w:b/>
                 <w:sz w:val="17"/>
               </w:rPr>
-              <w:t>160.706</w:t>
+              <w:t>169.948</w:t>
             </w:r>
           </w:p>
         </w:tc>
@@ -2353,7 +2353,7 @@
                 <w:b/>
                 <w:sz w:val="17"/>
               </w:rPr>
-              <w:t>16.941</w:t>
+              <w:t>18.790</w:t>
             </w:r>
           </w:p>
         </w:tc>
@@ -2371,7 +2371,7 @@
                 <w:b/>
                 <w:sz w:val="17"/>
               </w:rPr>
-              <w:t>18.230</w:t>
+              <w:t>31.204</w:t>
             </w:r>
           </w:p>
         </w:tc>
@@ -2389,7 +2389,7 @@
                 <w:b/>
                 <w:sz w:val="17"/>
               </w:rPr>
-              <w:t>195.877</w:t>
+              <w:t>219.942</w:t>
             </w:r>
           </w:p>
         </w:tc>
@@ -2407,7 +2407,7 @@
                 <w:b/>
                 <w:sz w:val="17"/>
               </w:rPr>
-              <w:t>0.885%</w:t>
+              <w:t>0.993%</w:t>
             </w:r>
           </w:p>
         </w:tc>

</xml_diff>

<commit_message>
Fix operational capacity to 526 MW across all documents; update scenario targets
Word doc (para 3): replace 3,475 MW / 912 MW operational with correct
  3,089 MW total / 526 MW operational, 2,563 MW pipeline; add note that
  capacity is planned to expand to 3,000 MW by 2030.

fiscal_slides.tex: update scenario slide
  - Current MW: 453 → 526 MW
  - Scenario A target: 2,800 → 3,000 MW
  - Scenario A annual cost: IDR 12.18T → 13.05T (0.059% / 0.039% GDP)
  - Lifetime total: IDR 110.4T → 118.3T
  - Combined A+B: 14.00T → 14.86T (0.044% 2030 GDP)
  Recompiled PDF (0 errors).

fiscal_cost_report.tex abstract already had correct 526 MW / 3,089 MW figures.

https://claude.ai/code/session_018m2ceypEakZpmjRE2PTWZv
</commit_message>
<xml_diff>
--- a/reports/fiscal_cost_report.docx
+++ b/reports/fiscal_cost_report.docx
@@ -98,103 +98,45 @@
         <w:jc w:val="both"/>
       </w:pPr>
       <w:r>
-        <w:t xml:space="preserve">Indonesia's data </w:t>
+        <w:t xml:space="preserve">Indonesia's data centres have attracted IDR 385.8 trillion in identified investment across 49 facilities. The location, investment and companies running the data centers have been identified in this note from by web scrapping publicly-available information, by imputing missing values and by cross-checking information with government references.The Indonesian data centers capacity encompasses 3,089 MW of total identified capacity (526 MW operational, 2,563 MW pipeline), with current plans to expand operational capacity to 3,000 MW by 2030. </w:t>
       </w:r>
       <w:proofErr w:type="spellStart"/>
-      <w:r>
-        <w:t>centre</w:t>
-      </w:r>
-      <w:r>
-        <w:t>s</w:t>
-      </w:r>
+      <w:r/>
+      <w:r/>
       <w:proofErr w:type="spellEnd"/>
-      <w:r>
-        <w:t xml:space="preserve"> </w:t>
-      </w:r>
-      <w:r>
-        <w:t>ha</w:t>
-      </w:r>
-      <w:r>
-        <w:t>ve</w:t>
-      </w:r>
-      <w:r>
-        <w:t xml:space="preserve"> attracted IDR 385.8 trillion </w:t>
-      </w:r>
-      <w:r>
-        <w:t>in identified investment across 49 facilities</w:t>
-      </w:r>
-      <w:r>
-        <w:t xml:space="preserve">. The location, investment and </w:t>
-      </w:r>
-      <w:r>
-        <w:t xml:space="preserve">companies </w:t>
-      </w:r>
-      <w:r>
-        <w:t xml:space="preserve">running the data centers have been identified </w:t>
-      </w:r>
-      <w:r>
-        <w:t xml:space="preserve">in this note </w:t>
-      </w:r>
-      <w:r>
-        <w:t xml:space="preserve">from by web scrapping </w:t>
-      </w:r>
+      <w:r/>
+      <w:r/>
+      <w:r/>
+      <w:r/>
+      <w:r/>
+      <w:r/>
+      <w:r/>
+      <w:r/>
+      <w:r/>
+      <w:r/>
       <w:proofErr w:type="gramStart"/>
-      <w:r>
-        <w:t>publicly</w:t>
-      </w:r>
-      <w:r>
-        <w:t>-available</w:t>
-      </w:r>
+      <w:r/>
+      <w:r/>
       <w:proofErr w:type="gramEnd"/>
-      <w:r>
-        <w:t xml:space="preserve"> information</w:t>
-      </w:r>
-      <w:r>
-        <w:t xml:space="preserve">, </w:t>
-      </w:r>
-      <w:r>
-        <w:t>by imputing missing values</w:t>
-      </w:r>
-      <w:r>
-        <w:t xml:space="preserve"> and by cross-checking information with government </w:t>
-      </w:r>
+      <w:r/>
+      <w:r/>
+      <w:r/>
+      <w:r/>
       <w:proofErr w:type="spellStart"/>
       <w:proofErr w:type="gramStart"/>
-      <w:r>
-        <w:t>references</w:t>
-      </w:r>
-      <w:r>
-        <w:t>.</w:t>
-      </w:r>
-      <w:r>
-        <w:t>The</w:t>
-      </w:r>
+      <w:r/>
+      <w:r/>
+      <w:r/>
       <w:proofErr w:type="spellEnd"/>
       <w:proofErr w:type="gramEnd"/>
-      <w:r>
-        <w:t xml:space="preserve"> Indonesian </w:t>
-      </w:r>
-      <w:r>
-        <w:t xml:space="preserve">data centers </w:t>
-      </w:r>
-      <w:r>
-        <w:t xml:space="preserve">capacity </w:t>
-      </w:r>
-      <w:r>
-        <w:t>encompass</w:t>
-      </w:r>
-      <w:r>
-        <w:t xml:space="preserve">es </w:t>
-      </w:r>
-      <w:r>
-        <w:t xml:space="preserve">3475 MW of current and pipeline </w:t>
-      </w:r>
-      <w:r>
-        <w:t>projects</w:t>
-      </w:r>
-      <w:r>
-        <w:t xml:space="preserve"> (912 MW operational, 2563 MW pipeline). </w:t>
-      </w:r>
+      <w:r/>
+      <w:r/>
+      <w:r/>
+      <w:r/>
+      <w:r/>
+      <w:r/>
+      <w:r/>
+      <w:r/>
     </w:p>
     <w:p>
       <w:pPr>

</xml_diff>

<commit_message>
Fix Scenario B to use same 3,000 MW / 660.4T base as Scenario A
Scenario B was inconsistently using the baseline investment (385.8T /
3,089 MW) rather than the Scenario A expansion investment (660.4T /
3,000 MW).

Changes across report, Word doc, and slides:
- Scenario B now applies universal VAT+duty to the same 660.4T
  investment base as Scenario A
- Shown as an incremental effect on top of Scenario A: +30.227T
  (= 660.4T × 35% × 13.5% − 0.977T existing SEZ = +0.137% GDP)
- Combined A+B unchanged: 219.942T (0.993% GDP)
- Standalone B row (3,089 MW / 385.8T) removed; single logical flow:
  Baseline → +A → A total → +B → Combined A+B
- Appendix assumption simplified to one row (IDR 231.1T VAT base)
- Slides updated: B annual cost 10.08T/yr (amortised); Combined 23.13T

https://claude.ai/code/session_018m2ceypEakZpmjRE2PTWZv
</commit_message>
<xml_diff>
--- a/reports/fiscal_cost_report.docx
+++ b/reports/fiscal_cost_report.docx
@@ -2063,7 +2063,7 @@
               <w:rPr>
                 <w:sz w:val="17"/>
               </w:rPr>
-              <w:t>B: Universal VAT</w:t>
+              <w:t>B: Universal VAT+Duty</w:t>
             </w:r>
           </w:p>
         </w:tc>
@@ -2080,7 +2080,7 @@
               <w:rPr>
                 <w:sz w:val="17"/>
               </w:rPr>
-              <w:t>3089</w:t>
+              <w:t>3000</w:t>
             </w:r>
           </w:p>
         </w:tc>
@@ -2097,7 +2097,7 @@
               <w:rPr>
                 <w:sz w:val="17"/>
               </w:rPr>
-              <w:t>385.8</w:t>
+              <w:t>660.4</w:t>
             </w:r>
           </w:p>
         </w:tc>
@@ -2114,7 +2114,7 @@
               <w:rPr>
                 <w:sz w:val="17"/>
               </w:rPr>
-              <w:t>118.705</w:t>
+              <w:t>—</w:t>
             </w:r>
           </w:p>
         </w:tc>
@@ -2131,7 +2131,7 @@
               <w:rPr>
                 <w:sz w:val="17"/>
               </w:rPr>
-              <w:t>10.977</w:t>
+              <w:t>—</w:t>
             </w:r>
           </w:p>
         </w:tc>
@@ -2148,7 +2148,7 @@
               <w:rPr>
                 <w:sz w:val="17"/>
               </w:rPr>
-              <w:t>18.230</w:t>
+              <w:t>+30.227</w:t>
             </w:r>
           </w:p>
         </w:tc>
@@ -2165,7 +2165,7 @@
               <w:rPr>
                 <w:sz w:val="17"/>
               </w:rPr>
-              <w:t>147.912</w:t>
+              <w:t>+30.227</w:t>
             </w:r>
           </w:p>
         </w:tc>
@@ -2182,7 +2182,7 @@
               <w:rPr>
                 <w:sz w:val="17"/>
               </w:rPr>
-              <w:t>0.668%</w:t>
+              <w:t>+0.137%</w:t>
             </w:r>
           </w:p>
         </w:tc>
@@ -17176,7 +17176,7 @@
               <w:rPr>
                 <w:sz w:val="18"/>
               </w:rPr>
-              <w:t>Scenario B: VAT base</w:t>
+              <w:t>Scenario B: VAT+Duty base</w:t>
             </w:r>
           </w:p>
         </w:tc>
@@ -17190,7 +17190,7 @@
               <w:rPr>
                 <w:sz w:val="18"/>
               </w:rPr>
-              <w:t>35% of all investment</w:t>
+              <w:t>35% of Scenario A investment (660.4T)</w:t>
             </w:r>
           </w:p>
         </w:tc>
@@ -17207,7 +17207,7 @@
               <w:rPr>
                 <w:sz w:val="18"/>
               </w:rPr>
-              <w:t>IDR 135.0T</w:t>
+              <w:t>IDR 231.1T</w:t>
             </w:r>
           </w:p>
         </w:tc>

</xml_diff>

<commit_message>
Fix Word doc Table 2: restore Baseline row and correct Scenario B
Remote had reverted to old state: Baseline row missing, Scenario B
showing old figures (3089 MW / 385.8T / 18.230T / 147.912T).

Fixed:
- Restored Baseline row (Row 1) to Table 2
- Scenario B row: 3089→3000, 385.8→660.4, CIT/SD→—, VAT 18.230→+30.227,
  Total 147.912→+30.227, 0.668%→+0.137%
- Para 12 description: Scenario B described as incremental on A
- Para 13 note: 17.253T replaced with 30.227T correct breakdown

https://claude.ai/code/session_018m2ceypEakZpmjRE2PTWZv
</commit_message>
<xml_diff>
--- a/reports/fiscal_cost_report.docx
+++ b/reports/fiscal_cost_report.docx
@@ -1304,7 +1304,7 @@
         <w:rPr>
           <w:sz w:val="20"/>
         </w:rPr>
-        <w:t>Scenario A: expansion to 3,000 MW operational by 2030, adding 2,474 MW beyond the current 526 MW at IDR 111B/MW (blended benchmark), requiring IDR 274.6T of additional investment. GMT/non-GMT split mirrors current database (43%/57%); 10-year holiday for new entrants. Scenario B: VAT and import duty exemptions extended to all operators, applying 35% equipment share to combined Scenario A investment (IDR 660.4T).</w:t>
+        <w:t>Scenario A: expansion to 3,000 MW operational by 2030, adding 2,474 MW beyond the current 526 MW at IDR 111B/MW (blended benchmark), requiring IDR 274.6T of additional investment. GMT/non-GMT split mirrors current database (43%/57%); 10-year holiday for new entrants. Scenario B: universal VAT and import duty extended to all operators (35% equipment share), evaluated on the same 3,000 MW / IDR 660.4T base as Scenario A; shown as an incremental effect on top of Scenario A.</w:t>
       </w:r>
     </w:p>
     <w:tbl>
@@ -1504,7 +1504,7 @@
               <w:rPr>
                 <w:sz w:val="17"/>
               </w:rPr>
-              <w:t>A: +2,474 MW by 2030</w:t>
+              <w:t>Baseline</w:t>
             </w:r>
           </w:p>
         </w:tc>
@@ -1521,7 +1521,7 @@
               <w:rPr>
                 <w:sz w:val="17"/>
               </w:rPr>
-              <w:t>+2474</w:t>
+              <w:t>3089</w:t>
             </w:r>
           </w:p>
         </w:tc>
@@ -1538,7 +1538,7 @@
               <w:rPr>
                 <w:sz w:val="17"/>
               </w:rPr>
-              <w:t>+274.6</w:t>
+              <w:t>385.8</w:t>
             </w:r>
           </w:p>
         </w:tc>
@@ -1555,7 +1555,7 @@
               <w:rPr>
                 <w:sz w:val="17"/>
               </w:rPr>
-              <w:t>+51.243</w:t>
+              <w:t>118.705</w:t>
             </w:r>
           </w:p>
         </w:tc>
@@ -1572,7 +1572,7 @@
               <w:rPr>
                 <w:sz w:val="17"/>
               </w:rPr>
-              <w:t>+7.813</w:t>
+              <w:t>10.977</w:t>
             </w:r>
           </w:p>
         </w:tc>
@@ -1589,7 +1589,7 @@
               <w:rPr>
                 <w:sz w:val="17"/>
               </w:rPr>
-              <w:t>—</w:t>
+              <w:t>0.977</w:t>
             </w:r>
           </w:p>
         </w:tc>
@@ -1606,7 +1606,7 @@
               <w:rPr>
                 <w:sz w:val="17"/>
               </w:rPr>
-              <w:t>+59.056</w:t>
+              <w:t>130.659</w:t>
             </w:r>
           </w:p>
         </w:tc>
@@ -1623,7 +1623,7 @@
               <w:rPr>
                 <w:sz w:val="17"/>
               </w:rPr>
-              <w:t>+0.267%</w:t>
+              <w:t>0.590%</w:t>
             </w:r>
           </w:p>
         </w:tc>
@@ -1640,136 +1640,128 @@
           <w:p>
             <w:r>
               <w:rPr>
-                <w:b/>
                 <w:sz w:val="17"/>
               </w:rPr>
-              <w:t>Scenario A total</w:t>
-            </w:r>
-          </w:p>
-        </w:tc>
-        <w:tc>
-          <w:tcPr>
-            <w:tcW w:w="1170" w:type="dxa"/>
-            <w:vAlign w:val="center"/>
-          </w:tcPr>
-          <w:p>
-            <w:pPr>
-              <w:jc w:val="right"/>
-            </w:pPr>
-            <w:r>
-              <w:rPr>
-                <w:b/>
+              <w:t>A: +2,474 MW by 2030</w:t>
+            </w:r>
+          </w:p>
+        </w:tc>
+        <w:tc>
+          <w:tcPr>
+            <w:tcW w:w="1170" w:type="dxa"/>
+            <w:vAlign w:val="center"/>
+          </w:tcPr>
+          <w:p>
+            <w:pPr>
+              <w:jc w:val="right"/>
+            </w:pPr>
+            <w:r>
+              <w:rPr>
                 <w:sz w:val="17"/>
               </w:rPr>
-              <w:t>3000</w:t>
-            </w:r>
-          </w:p>
-        </w:tc>
-        <w:tc>
-          <w:tcPr>
-            <w:tcW w:w="1170" w:type="dxa"/>
-            <w:vAlign w:val="center"/>
-          </w:tcPr>
-          <w:p>
-            <w:pPr>
-              <w:jc w:val="right"/>
-            </w:pPr>
-            <w:r>
-              <w:rPr>
-                <w:b/>
+              <w:t>+2474</w:t>
+            </w:r>
+          </w:p>
+        </w:tc>
+        <w:tc>
+          <w:tcPr>
+            <w:tcW w:w="1170" w:type="dxa"/>
+            <w:vAlign w:val="center"/>
+          </w:tcPr>
+          <w:p>
+            <w:pPr>
+              <w:jc w:val="right"/>
+            </w:pPr>
+            <w:r>
+              <w:rPr>
                 <w:sz w:val="17"/>
               </w:rPr>
-              <w:t>660.4</w:t>
-            </w:r>
-          </w:p>
-        </w:tc>
-        <w:tc>
-          <w:tcPr>
-            <w:tcW w:w="1170" w:type="dxa"/>
-            <w:vAlign w:val="center"/>
-          </w:tcPr>
-          <w:p>
-            <w:pPr>
-              <w:jc w:val="right"/>
-            </w:pPr>
-            <w:r>
-              <w:rPr>
-                <w:b/>
+              <w:t>+274.6</w:t>
+            </w:r>
+          </w:p>
+        </w:tc>
+        <w:tc>
+          <w:tcPr>
+            <w:tcW w:w="1170" w:type="dxa"/>
+            <w:vAlign w:val="center"/>
+          </w:tcPr>
+          <w:p>
+            <w:pPr>
+              <w:jc w:val="right"/>
+            </w:pPr>
+            <w:r>
+              <w:rPr>
                 <w:sz w:val="17"/>
               </w:rPr>
-              <w:t>169.948</w:t>
-            </w:r>
-          </w:p>
-        </w:tc>
-        <w:tc>
-          <w:tcPr>
-            <w:tcW w:w="1170" w:type="dxa"/>
-            <w:vAlign w:val="center"/>
-          </w:tcPr>
-          <w:p>
-            <w:pPr>
-              <w:jc w:val="right"/>
-            </w:pPr>
-            <w:r>
-              <w:rPr>
-                <w:b/>
+              <w:t>+51.243</w:t>
+            </w:r>
+          </w:p>
+        </w:tc>
+        <w:tc>
+          <w:tcPr>
+            <w:tcW w:w="1170" w:type="dxa"/>
+            <w:vAlign w:val="center"/>
+          </w:tcPr>
+          <w:p>
+            <w:pPr>
+              <w:jc w:val="right"/>
+            </w:pPr>
+            <w:r>
+              <w:rPr>
                 <w:sz w:val="17"/>
               </w:rPr>
-              <w:t>18.790</w:t>
-            </w:r>
-          </w:p>
-        </w:tc>
-        <w:tc>
-          <w:tcPr>
-            <w:tcW w:w="1170" w:type="dxa"/>
-            <w:vAlign w:val="center"/>
-          </w:tcPr>
-          <w:p>
-            <w:pPr>
-              <w:jc w:val="right"/>
-            </w:pPr>
-            <w:r>
-              <w:rPr>
-                <w:b/>
+              <w:t>+7.813</w:t>
+            </w:r>
+          </w:p>
+        </w:tc>
+        <w:tc>
+          <w:tcPr>
+            <w:tcW w:w="1170" w:type="dxa"/>
+            <w:vAlign w:val="center"/>
+          </w:tcPr>
+          <w:p>
+            <w:pPr>
+              <w:jc w:val="right"/>
+            </w:pPr>
+            <w:r>
+              <w:rPr>
                 <w:sz w:val="17"/>
               </w:rPr>
-              <w:t>0.977</w:t>
-            </w:r>
-          </w:p>
-        </w:tc>
-        <w:tc>
-          <w:tcPr>
-            <w:tcW w:w="1170" w:type="dxa"/>
-            <w:vAlign w:val="center"/>
-          </w:tcPr>
-          <w:p>
-            <w:pPr>
-              <w:jc w:val="right"/>
-            </w:pPr>
-            <w:r>
-              <w:rPr>
-                <w:b/>
+              <w:t>—</w:t>
+            </w:r>
+          </w:p>
+        </w:tc>
+        <w:tc>
+          <w:tcPr>
+            <w:tcW w:w="1170" w:type="dxa"/>
+            <w:vAlign w:val="center"/>
+          </w:tcPr>
+          <w:p>
+            <w:pPr>
+              <w:jc w:val="right"/>
+            </w:pPr>
+            <w:r>
+              <w:rPr>
                 <w:sz w:val="17"/>
               </w:rPr>
-              <w:t>189.715</w:t>
-            </w:r>
-          </w:p>
-        </w:tc>
-        <w:tc>
-          <w:tcPr>
-            <w:tcW w:w="1170" w:type="dxa"/>
-            <w:vAlign w:val="center"/>
-          </w:tcPr>
-          <w:p>
-            <w:pPr>
-              <w:jc w:val="right"/>
-            </w:pPr>
-            <w:r>
-              <w:rPr>
-                <w:b/>
+              <w:t>+59.056</w:t>
+            </w:r>
+          </w:p>
+        </w:tc>
+        <w:tc>
+          <w:tcPr>
+            <w:tcW w:w="1170" w:type="dxa"/>
+            <w:vAlign w:val="center"/>
+          </w:tcPr>
+          <w:p>
+            <w:pPr>
+              <w:jc w:val="right"/>
+            </w:pPr>
+            <w:r>
+              <w:rPr>
                 <w:sz w:val="17"/>
               </w:rPr>
-              <w:t>0.857%</w:t>
+              <w:t>+0.267%</w:t>
             </w:r>
           </w:p>
         </w:tc>
@@ -1786,128 +1778,274 @@
           <w:p>
             <w:r>
               <w:rPr>
+                <w:b/>
                 <w:sz w:val="17"/>
               </w:rPr>
-              <w:t>B: Universal VAT</w:t>
-            </w:r>
-          </w:p>
-        </w:tc>
-        <w:tc>
-          <w:tcPr>
-            <w:tcW w:w="1170" w:type="dxa"/>
-            <w:vAlign w:val="center"/>
-          </w:tcPr>
-          <w:p>
-            <w:pPr>
-              <w:jc w:val="right"/>
-            </w:pPr>
-            <w:r>
-              <w:rPr>
+              <w:t>Scenario A total</w:t>
+            </w:r>
+          </w:p>
+        </w:tc>
+        <w:tc>
+          <w:tcPr>
+            <w:tcW w:w="1170" w:type="dxa"/>
+            <w:vAlign w:val="center"/>
+          </w:tcPr>
+          <w:p>
+            <w:pPr>
+              <w:jc w:val="right"/>
+            </w:pPr>
+            <w:r>
+              <w:rPr>
+                <w:b/>
                 <w:sz w:val="17"/>
               </w:rPr>
-              <w:t>3089</w:t>
-            </w:r>
-          </w:p>
-        </w:tc>
-        <w:tc>
-          <w:tcPr>
-            <w:tcW w:w="1170" w:type="dxa"/>
-            <w:vAlign w:val="center"/>
-          </w:tcPr>
-          <w:p>
-            <w:pPr>
-              <w:jc w:val="right"/>
-            </w:pPr>
-            <w:r>
-              <w:rPr>
+              <w:t>3000</w:t>
+            </w:r>
+          </w:p>
+        </w:tc>
+        <w:tc>
+          <w:tcPr>
+            <w:tcW w:w="1170" w:type="dxa"/>
+            <w:vAlign w:val="center"/>
+          </w:tcPr>
+          <w:p>
+            <w:pPr>
+              <w:jc w:val="right"/>
+            </w:pPr>
+            <w:r>
+              <w:rPr>
+                <w:b/>
                 <w:sz w:val="17"/>
               </w:rPr>
-              <w:t>385.8</w:t>
-            </w:r>
-          </w:p>
-        </w:tc>
-        <w:tc>
-          <w:tcPr>
-            <w:tcW w:w="1170" w:type="dxa"/>
-            <w:vAlign w:val="center"/>
-          </w:tcPr>
-          <w:p>
-            <w:pPr>
-              <w:jc w:val="right"/>
-            </w:pPr>
-            <w:r>
-              <w:rPr>
+              <w:t>660.4</w:t>
+            </w:r>
+          </w:p>
+        </w:tc>
+        <w:tc>
+          <w:tcPr>
+            <w:tcW w:w="1170" w:type="dxa"/>
+            <w:vAlign w:val="center"/>
+          </w:tcPr>
+          <w:p>
+            <w:pPr>
+              <w:jc w:val="right"/>
+            </w:pPr>
+            <w:r>
+              <w:rPr>
+                <w:b/>
                 <w:sz w:val="17"/>
               </w:rPr>
-              <w:t>118.705</w:t>
-            </w:r>
-          </w:p>
-        </w:tc>
-        <w:tc>
-          <w:tcPr>
-            <w:tcW w:w="1170" w:type="dxa"/>
-            <w:vAlign w:val="center"/>
-          </w:tcPr>
-          <w:p>
-            <w:pPr>
-              <w:jc w:val="right"/>
-            </w:pPr>
-            <w:r>
-              <w:rPr>
+              <w:t>169.948</w:t>
+            </w:r>
+          </w:p>
+        </w:tc>
+        <w:tc>
+          <w:tcPr>
+            <w:tcW w:w="1170" w:type="dxa"/>
+            <w:vAlign w:val="center"/>
+          </w:tcPr>
+          <w:p>
+            <w:pPr>
+              <w:jc w:val="right"/>
+            </w:pPr>
+            <w:r>
+              <w:rPr>
+                <w:b/>
                 <w:sz w:val="17"/>
               </w:rPr>
-              <w:t>10.977</w:t>
-            </w:r>
-          </w:p>
-        </w:tc>
-        <w:tc>
-          <w:tcPr>
-            <w:tcW w:w="1170" w:type="dxa"/>
-            <w:vAlign w:val="center"/>
-          </w:tcPr>
-          <w:p>
-            <w:pPr>
-              <w:jc w:val="right"/>
-            </w:pPr>
-            <w:r>
-              <w:rPr>
+              <w:t>18.790</w:t>
+            </w:r>
+          </w:p>
+        </w:tc>
+        <w:tc>
+          <w:tcPr>
+            <w:tcW w:w="1170" w:type="dxa"/>
+            <w:vAlign w:val="center"/>
+          </w:tcPr>
+          <w:p>
+            <w:pPr>
+              <w:jc w:val="right"/>
+            </w:pPr>
+            <w:r>
+              <w:rPr>
+                <w:b/>
                 <w:sz w:val="17"/>
               </w:rPr>
-              <w:t>18.230</w:t>
-            </w:r>
-          </w:p>
-        </w:tc>
-        <w:tc>
-          <w:tcPr>
-            <w:tcW w:w="1170" w:type="dxa"/>
-            <w:vAlign w:val="center"/>
-          </w:tcPr>
-          <w:p>
-            <w:pPr>
-              <w:jc w:val="right"/>
-            </w:pPr>
-            <w:r>
-              <w:rPr>
+              <w:t>0.977</w:t>
+            </w:r>
+          </w:p>
+        </w:tc>
+        <w:tc>
+          <w:tcPr>
+            <w:tcW w:w="1170" w:type="dxa"/>
+            <w:vAlign w:val="center"/>
+          </w:tcPr>
+          <w:p>
+            <w:pPr>
+              <w:jc w:val="right"/>
+            </w:pPr>
+            <w:r>
+              <w:rPr>
+                <w:b/>
                 <w:sz w:val="17"/>
               </w:rPr>
-              <w:t>147.912</w:t>
-            </w:r>
-          </w:p>
-        </w:tc>
-        <w:tc>
-          <w:tcPr>
-            <w:tcW w:w="1170" w:type="dxa"/>
-            <w:vAlign w:val="center"/>
-          </w:tcPr>
-          <w:p>
-            <w:pPr>
-              <w:jc w:val="right"/>
-            </w:pPr>
-            <w:r>
-              <w:rPr>
+              <w:t>189.715</w:t>
+            </w:r>
+          </w:p>
+        </w:tc>
+        <w:tc>
+          <w:tcPr>
+            <w:tcW w:w="1170" w:type="dxa"/>
+            <w:vAlign w:val="center"/>
+          </w:tcPr>
+          <w:p>
+            <w:pPr>
+              <w:jc w:val="right"/>
+            </w:pPr>
+            <w:r>
+              <w:rPr>
+                <w:b/>
                 <w:sz w:val="17"/>
               </w:rPr>
-              <w:t>0.668%</w:t>
+              <w:t>0.857%</w:t>
+            </w:r>
+          </w:p>
+        </w:tc>
+      </w:tr>
+      <w:tr>
+        <w:trPr>
+          <w:jc w:val="center"/>
+        </w:trPr>
+        <w:tc>
+          <w:tcPr>
+            <w:tcW w:w="1170" w:type="dxa"/>
+            <w:vAlign w:val="center"/>
+          </w:tcPr>
+          <w:p>
+            <w:r>
+              <w:rPr>
+                <w:sz w:val="17"/>
+              </w:rPr>
+              <w:t>B: Universal VAT+Duty</w:t>
+            </w:r>
+          </w:p>
+        </w:tc>
+        <w:tc>
+          <w:tcPr>
+            <w:tcW w:w="1170" w:type="dxa"/>
+            <w:vAlign w:val="center"/>
+          </w:tcPr>
+          <w:p>
+            <w:pPr>
+              <w:jc w:val="right"/>
+            </w:pPr>
+            <w:r>
+              <w:rPr>
+                <w:sz w:val="17"/>
+              </w:rPr>
+              <w:t>3000</w:t>
+            </w:r>
+          </w:p>
+        </w:tc>
+        <w:tc>
+          <w:tcPr>
+            <w:tcW w:w="1170" w:type="dxa"/>
+            <w:vAlign w:val="center"/>
+          </w:tcPr>
+          <w:p>
+            <w:pPr>
+              <w:jc w:val="right"/>
+            </w:pPr>
+            <w:r>
+              <w:rPr>
+                <w:sz w:val="17"/>
+              </w:rPr>
+              <w:t>660.4</w:t>
+            </w:r>
+          </w:p>
+        </w:tc>
+        <w:tc>
+          <w:tcPr>
+            <w:tcW w:w="1170" w:type="dxa"/>
+            <w:vAlign w:val="center"/>
+          </w:tcPr>
+          <w:p>
+            <w:pPr>
+              <w:jc w:val="right"/>
+            </w:pPr>
+            <w:r>
+              <w:rPr>
+                <w:sz w:val="17"/>
+              </w:rPr>
+              <w:t>—</w:t>
+            </w:r>
+          </w:p>
+        </w:tc>
+        <w:tc>
+          <w:tcPr>
+            <w:tcW w:w="1170" w:type="dxa"/>
+            <w:vAlign w:val="center"/>
+          </w:tcPr>
+          <w:p>
+            <w:pPr>
+              <w:jc w:val="right"/>
+            </w:pPr>
+            <w:r>
+              <w:rPr>
+                <w:sz w:val="17"/>
+              </w:rPr>
+              <w:t>—</w:t>
+            </w:r>
+          </w:p>
+        </w:tc>
+        <w:tc>
+          <w:tcPr>
+            <w:tcW w:w="1170" w:type="dxa"/>
+            <w:vAlign w:val="center"/>
+          </w:tcPr>
+          <w:p>
+            <w:pPr>
+              <w:jc w:val="right"/>
+            </w:pPr>
+            <w:r>
+              <w:rPr>
+                <w:sz w:val="17"/>
+              </w:rPr>
+              <w:t>+30.227</w:t>
+            </w:r>
+          </w:p>
+        </w:tc>
+        <w:tc>
+          <w:tcPr>
+            <w:tcW w:w="1170" w:type="dxa"/>
+            <w:vAlign w:val="center"/>
+          </w:tcPr>
+          <w:p>
+            <w:pPr>
+              <w:jc w:val="right"/>
+            </w:pPr>
+            <w:r>
+              <w:rPr>
+                <w:sz w:val="17"/>
+              </w:rPr>
+              <w:t>+30.227</w:t>
+            </w:r>
+          </w:p>
+        </w:tc>
+        <w:tc>
+          <w:tcPr>
+            <w:tcW w:w="1170" w:type="dxa"/>
+            <w:vAlign w:val="center"/>
+          </w:tcPr>
+          <w:p>
+            <w:pPr>
+              <w:jc w:val="right"/>
+            </w:pPr>
+            <w:r>
+              <w:rPr>
+                <w:sz w:val="17"/>
+              </w:rPr>
+              <w:t>+0.137%</w:t>
             </w:r>
           </w:p>
         </w:tc>
@@ -2084,7 +2222,7 @@
           <w:i/>
           <w:sz w:val="17"/>
         </w:rPr>
-        <w:t xml:space="preserve"> = one-time at construction. Scenario A assumes no additional SEZ concessions. Scenario B incremental above baseline: IDR 17.253T (VAT: IDR 14.854T + duty: IDR 3.376T).</w:t>
+        <w:t xml:space="preserve"> = one-time at construction. Scenario A assumes no additional SEZ concessions. Scenario B incremental VAT+Duty (universal, on 3,000 MW base): IDR 30.227T (VAT: IDR 25.425T + duty: IDR 5.779T). Combined A+B total: IDR 219.942T (0.993% of GDP).</w:t>
       </w:r>
     </w:p>
     <w:p/>

</xml_diff>

<commit_message>
Rework Table 2: baseline = 526 MW operational; % GDP = annual
Two structural changes to the scenarios table:

1. Baseline now shows only 27 operational facilities (526 MW):
   - Investment: 76.1T (was 385.8T all 49 facilities)
   - Cumulative CIT: 15.695T, SD: 2.172T, VAT+Duty: 0.168T
   - Total cumulative: 18.035T
   - Annual % GDP: 0.007%

2. % GDP column now shows annual peak cost (not cumulative):
   - Baseline: 0.007% | A incremental: +0.023% | A total: 0.030%
   - B incremental: +0.025% | Combined A+B: 0.055%

Scenario B investment base updated: 660.4T → 350.7T
  (operational 76.1T + expansion 274.6T)
  VAT+Duty incremental: 30.227T → 16.401T (VAT 13.500T + duty 3.068T)
  Combined A+B total: 219.942T → 93.492T

Slides updated to match: A annual 13.05T→6.68T, B annual 5.47T,
Combined 12.15T; all at 2030 GDP basis 0.036%.

https://claude.ai/code/session_018m2ceypEakZpmjRE2PTWZv
</commit_message>
<xml_diff>
--- a/reports/fiscal_cost_report.docx
+++ b/reports/fiscal_cost_report.docx
@@ -1304,7 +1304,7 @@
         <w:rPr>
           <w:sz w:val="20"/>
         </w:rPr>
-        <w:t>Scenario A: expansion to 3,000 MW operational by 2030, adding 2,474 MW beyond the current 526 MW at IDR 111B/MW (blended benchmark), requiring IDR 274.6T of additional investment. GMT/non-GMT split mirrors current database (43%/57%); 10-year holiday for new entrants. Scenario B: universal VAT and import duty extended to all operators (35% equipment share), evaluated on the same 3,000 MW / IDR 660.4T base as Scenario A; shown as an incremental effect on top of Scenario A.</w:t>
+        <w:t>Scenario A: expansion to 3,000 MW operational by 2030, adding 2,474 MW beyond the current 526 MW at IDR 111B/MW (blended benchmark), requiring IDR 274.6T of additional investment. GMT/non-GMT split mirrors current database (43%/57%); 10-year holiday for new entrants. Scenario B: universal VAT and import duty extended to all operators (35% equipment share), evaluated on the same 3,000 MW / IDR 350.7T investment base as Scenario A (operational 76.1T + expansion 274.6T); incremental effect on top of Scenario A.</w:t>
       </w:r>
     </w:p>
     <w:tbl>
@@ -1439,7 +1439,7 @@
                 <w:b/>
                 <w:sz w:val="17"/>
               </w:rPr>
-              <w:t>VAT+Duty</w:t>
+              <w:t>VAT+Duty (IDR T)</w:t>
             </w:r>
             <w:proofErr w:type="spellEnd"/>
             <w:r>
@@ -1447,7 +1447,6 @@
                 <w:b/>
                 <w:sz w:val="17"/>
               </w:rPr>
-              <w:t xml:space="preserve"> (IDR T)</w:t>
             </w:r>
           </w:p>
         </w:tc>
@@ -1485,7 +1484,7 @@
                 <w:b/>
                 <w:sz w:val="17"/>
               </w:rPr>
-              <w:t>% GDP</w:t>
+              <w:t>Ann. % GDP</w:t>
             </w:r>
           </w:p>
         </w:tc>
@@ -1504,7 +1503,7 @@
               <w:rPr>
                 <w:sz w:val="17"/>
               </w:rPr>
-              <w:t>Baseline</w:t>
+              <w:t>Baseline (526 MW op.)</w:t>
             </w:r>
           </w:p>
         </w:tc>
@@ -1521,7 +1520,7 @@
               <w:rPr>
                 <w:sz w:val="17"/>
               </w:rPr>
-              <w:t>3089</w:t>
+              <w:t>526</w:t>
             </w:r>
           </w:p>
         </w:tc>
@@ -1538,7 +1537,7 @@
               <w:rPr>
                 <w:sz w:val="17"/>
               </w:rPr>
-              <w:t>385.8</w:t>
+              <w:t>76.1</w:t>
             </w:r>
           </w:p>
         </w:tc>
@@ -1555,7 +1554,7 @@
               <w:rPr>
                 <w:sz w:val="17"/>
               </w:rPr>
-              <w:t>118.705</w:t>
+              <w:t>15.695</w:t>
             </w:r>
           </w:p>
         </w:tc>
@@ -1572,7 +1571,7 @@
               <w:rPr>
                 <w:sz w:val="17"/>
               </w:rPr>
-              <w:t>10.977</w:t>
+              <w:t>2.172</w:t>
             </w:r>
           </w:p>
         </w:tc>
@@ -1589,7 +1588,7 @@
               <w:rPr>
                 <w:sz w:val="17"/>
               </w:rPr>
-              <w:t>0.977</w:t>
+              <w:t>0.168</w:t>
             </w:r>
           </w:p>
         </w:tc>
@@ -1606,7 +1605,7 @@
               <w:rPr>
                 <w:sz w:val="17"/>
               </w:rPr>
-              <w:t>130.659</w:t>
+              <w:t>18.035</w:t>
             </w:r>
           </w:p>
         </w:tc>
@@ -1623,7 +1622,7 @@
               <w:rPr>
                 <w:sz w:val="17"/>
               </w:rPr>
-              <w:t>0.590%</w:t>
+              <w:t>0.007%</w:t>
             </w:r>
           </w:p>
         </w:tc>
@@ -1761,7 +1760,7 @@
               <w:rPr>
                 <w:sz w:val="17"/>
               </w:rPr>
-              <w:t>+0.267%</w:t>
+              <w:t>+0.023%</w:t>
             </w:r>
           </w:p>
         </w:tc>
@@ -1817,7 +1816,7 @@
                 <w:b/>
                 <w:sz w:val="17"/>
               </w:rPr>
-              <w:t>660.4</w:t>
+              <w:t>350.7</w:t>
             </w:r>
           </w:p>
         </w:tc>
@@ -1835,7 +1834,7 @@
                 <w:b/>
                 <w:sz w:val="17"/>
               </w:rPr>
-              <w:t>169.948</w:t>
+              <w:t>66.938</w:t>
             </w:r>
           </w:p>
         </w:tc>
@@ -1853,7 +1852,7 @@
                 <w:b/>
                 <w:sz w:val="17"/>
               </w:rPr>
-              <w:t>18.790</w:t>
+              <w:t>9.985</w:t>
             </w:r>
           </w:p>
         </w:tc>
@@ -1871,7 +1870,7 @@
                 <w:b/>
                 <w:sz w:val="17"/>
               </w:rPr>
-              <w:t>0.977</w:t>
+              <w:t>0.168</w:t>
             </w:r>
           </w:p>
         </w:tc>
@@ -1889,7 +1888,7 @@
                 <w:b/>
                 <w:sz w:val="17"/>
               </w:rPr>
-              <w:t>189.715</w:t>
+              <w:t>77.091</w:t>
             </w:r>
           </w:p>
         </w:tc>
@@ -1907,7 +1906,7 @@
                 <w:b/>
                 <w:sz w:val="17"/>
               </w:rPr>
-              <w:t>0.857%</w:t>
+              <w:t>0.030%</w:t>
             </w:r>
           </w:p>
         </w:tc>
@@ -1960,7 +1959,7 @@
               <w:rPr>
                 <w:sz w:val="17"/>
               </w:rPr>
-              <w:t>660.4</w:t>
+              <w:t>350.7</w:t>
             </w:r>
           </w:p>
         </w:tc>
@@ -2011,7 +2010,7 @@
               <w:rPr>
                 <w:sz w:val="17"/>
               </w:rPr>
-              <w:t>+30.227</w:t>
+              <w:t>+16.401</w:t>
             </w:r>
           </w:p>
         </w:tc>
@@ -2028,7 +2027,7 @@
               <w:rPr>
                 <w:sz w:val="17"/>
               </w:rPr>
-              <w:t>+30.227</w:t>
+              <w:t>+16.401</w:t>
             </w:r>
           </w:p>
         </w:tc>
@@ -2045,7 +2044,7 @@
               <w:rPr>
                 <w:sz w:val="17"/>
               </w:rPr>
-              <w:t>+0.137%</w:t>
+              <w:t>+0.025%</w:t>
             </w:r>
           </w:p>
         </w:tc>
@@ -2101,7 +2100,7 @@
                 <w:b/>
                 <w:sz w:val="17"/>
               </w:rPr>
-              <w:t>660.4</w:t>
+              <w:t>350.7</w:t>
             </w:r>
           </w:p>
         </w:tc>
@@ -2119,7 +2118,7 @@
                 <w:b/>
                 <w:sz w:val="17"/>
               </w:rPr>
-              <w:t>169.948</w:t>
+              <w:t>66.938</w:t>
             </w:r>
           </w:p>
         </w:tc>
@@ -2137,7 +2136,7 @@
                 <w:b/>
                 <w:sz w:val="17"/>
               </w:rPr>
-              <w:t>18.790</w:t>
+              <w:t>9.985</w:t>
             </w:r>
           </w:p>
         </w:tc>
@@ -2155,7 +2154,7 @@
                 <w:b/>
                 <w:sz w:val="17"/>
               </w:rPr>
-              <w:t>31.204</w:t>
+              <w:t>16.569</w:t>
             </w:r>
           </w:p>
         </w:tc>
@@ -2173,7 +2172,7 @@
                 <w:b/>
                 <w:sz w:val="17"/>
               </w:rPr>
-              <w:t>219.942</w:t>
+              <w:t>93.492</w:t>
             </w:r>
           </w:p>
         </w:tc>
@@ -2191,7 +2190,7 @@
                 <w:b/>
                 <w:sz w:val="17"/>
               </w:rPr>
-              <w:t>0.993%</w:t>
+              <w:t>0.055%</w:t>
             </w:r>
           </w:p>
         </w:tc>
@@ -2222,7 +2221,7 @@
           <w:i/>
           <w:sz w:val="17"/>
         </w:rPr>
-        <w:t xml:space="preserve"> = one-time at construction. Scenario A assumes no additional SEZ concessions. Scenario B incremental VAT+Duty (universal, on 3,000 MW base): IDR 30.227T (VAT: IDR 25.425T + duty: IDR 5.779T). Combined A+B total: IDR 219.942T (0.993% of GDP).</w:t>
+        <w:t xml:space="preserve"> = one-time at construction. Scenario A assumes no additional SEZ concessions. Ann. % GDP = annual peak fiscal cost / 2024 GDP. Scenario B incremental VAT+Duty (universal, on Scenario A base of 350.7T): IDR 16.401T (VAT: IDR 13.500T + duty: IDR 3.068T). Combined A+B total: IDR 93.492T.</w:t>
       </w:r>
     </w:p>
     <w:p/>

</xml_diff>